<commit_message>
User docs: Info Display reference for 1.16.1
V.LAT two decimals, ROVER whole metres, console whole-number speeds; the
DOCKING, ROVER and ORBITAL AUTOPILOT renders regenerated.

Co-Authored-By: Claude Opus 5.5 <noreply@anthropic.com>
Claude-Session: https://claude.ai/code/session_01AfFKiY5R8Xk7jem2zcWdES
</commit_message>
<xml_diff>
--- a/Documents/User/Info_Display_Screen_Reference.docx
+++ b/Documents/User/Info_Display_Screen_Reference.docx
@@ -52,7 +52,7 @@
         <w:t xml:space="preserve">Applies to:</w:t>
       </w:r>
       <w:r>
-        <w:t xml:space="preserve"> KCMk1_InfoDisp firmware 1.16.0</w:t>
+        <w:t xml:space="preserve"> KCMk1_InfoDisp firmware 1.16.1</w:t>
       </w:r>
     </w:p>
     <w:p>
@@ -3465,7 +3465,22 @@
                 <w:sz w:val="17"/>
                 <w:szCs w:val="17"/>
               </w:rPr>
-              <w:t xml:space="preserve">); then km, Mm, Gm</w:t>
+              <w:t xml:space="preserve">); then km, Mm, Gm. ROVER's DIST and ALT.TRN are whole metres throughout (</w:t>
+            </w:r>
+            <w:r>
+              <w:rPr>
+                <w:rFonts w:ascii="Consolas" w:cs="Consolas" w:eastAsia="Consolas" w:hAnsi="Consolas"/>
+                <w:sz w:val="17"/>
+                <w:szCs w:val="17"/>
+              </w:rPr>
+              <w:t xml:space="preserve">850 m</w:t>
+            </w:r>
+            <w:r>
+              <w:rPr>
+                <w:sz w:val="17"/>
+                <w:szCs w:val="17"/>
+              </w:rPr>
+              <w:t xml:space="preserve">)</w:t>
             </w:r>
           </w:p>
         </w:tc>
@@ -3543,6 +3558,36 @@
                 <w:szCs w:val="17"/>
               </w:rPr>
               <w:t xml:space="preserve">2,200 m/s</w:t>
+            </w:r>
+            <w:r>
+              <w:rPr>
+                <w:sz w:val="17"/>
+                <w:szCs w:val="17"/>
+              </w:rPr>
+              <w:t xml:space="preserve">). The autopilot consoles show whole numbers throughout (</w:t>
+            </w:r>
+            <w:r>
+              <w:rPr>
+                <w:rFonts w:ascii="Consolas" w:cs="Consolas" w:eastAsia="Consolas" w:hAnsi="Consolas"/>
+                <w:sz w:val="17"/>
+                <w:szCs w:val="17"/>
+              </w:rPr>
+              <w:t xml:space="preserve">842 m/s</w:t>
+            </w:r>
+            <w:r>
+              <w:rPr>
+                <w:sz w:val="17"/>
+                <w:szCs w:val="17"/>
+              </w:rPr>
+              <w:t xml:space="preserve">, </w:t>
+            </w:r>
+            <w:r>
+              <w:rPr>
+                <w:rFonts w:ascii="Consolas" w:cs="Consolas" w:eastAsia="Consolas" w:hAnsi="Consolas"/>
+                <w:sz w:val="17"/>
+                <w:szCs w:val="17"/>
+              </w:rPr>
+              <w:t xml:space="preserve">1,450 m/s</w:t>
             </w:r>
             <w:r>
               <w:rPr>
@@ -19306,7 +19351,7 @@
         <w:spacing w:after="60"/>
       </w:pPr>
       <w:r>
-        <w:t xml:space="preserve">Keep V.LAT green (under 0.1 m/s).</w:t>
+        <w:t xml:space="preserve">Keep V.LAT green (under 0.10 m/s).</w:t>
       </w:r>
     </w:p>
     <w:p>
@@ -19843,7 +19888,7 @@
                 <w:sz w:val="17"/>
                 <w:szCs w:val="17"/>
               </w:rPr>
-              <w:t xml:space="preserve">Lateral drift: speed across the line to the port, one decimal</w:t>
+              <w:t xml:space="preserve">Lateral drift: speed across the line to the port, two decimals</w:t>
             </w:r>
           </w:p>
         </w:tc>
@@ -19869,7 +19914,7 @@
                 <w:sz w:val="17"/>
                 <w:szCs w:val="17"/>
               </w:rPr>
-              <w:t xml:space="preserve">Green under 0.1 m/s; yellow from 0.1; white on red from 0.5</w:t>
+              <w:t xml:space="preserve">Green under 0.10 m/s; yellow from 0.10; white on red from 0.50 (judged on the value as shown)</w:t>
             </w:r>
           </w:p>
         </w:tc>

</xml_diff>

<commit_message>
InfoDisp 1.16.2: Landing Autopilot ATT REF VERT; vertical hold shown, not alarmed
- Console ATT REF toggle reads RETRO / VERT (bit 3 = the pilot's choice).
- POWERED DESCENT SAS button: with SAS off while the landing frame's new
  bit 7 (vertHold) is set, reads VERT in green instead of the SAS-off
  alarm; RAD+ is white on red with the other non-landing modes.
- Demo reports vertHold as Controller_Main does; LNDGAP render scenario
  and its caption use VERT.
- Mission_Autopilot.md 5.2 and the user reference describe RETRO, VERT,
  the vertical hold, why not RADIAL OUT, and the flight test to run.

Refs #68

Co-Authored-By: Claude Opus 5.5 <noreply@anthropic.com>
Claude-Session: https://claude.ai/code/session_01AfFKiY5R8Xk7jem2zcWdES
</commit_message>
<xml_diff>
--- a/Documents/User/Info_Display_Screen_Reference.docx
+++ b/Documents/User/Info_Display_Screen_Reference.docx
@@ -52,7 +52,7 @@
         <w:t xml:space="preserve">Applies to:</w:t>
       </w:r>
       <w:r>
-        <w:t xml:space="preserve"> KCMk1_InfoDisp firmware 1.16.1</w:t>
+        <w:t xml:space="preserve"> KCMk1_InfoDisp firmware 1.16.2</w:t>
       </w:r>
     </w:p>
     <w:p>
@@ -22681,7 +22681,7 @@
         <w:spacing w:after="60"/>
       </w:pPr>
       <w:r>
-        <w:t xml:space="preserve">SAS shows the mode's name. STAB, RETR and RAD+ (radial out, the Landing Autopilot's vertical reference) are white on green; any other mode is white on red, wrong for a landing; </w:t>
+        <w:t xml:space="preserve">SAS shows the mode's name. STAB and RETR are white on green; any other mode is white on red, wrong for a landing. That includes RAD+: radial out is only vertical while moving horizontally, and in a vertical descent it points near the horizon. </w:t>
       </w:r>
       <w:r>
         <w:rPr>
@@ -22690,7 +22690,16 @@
         <w:t xml:space="preserve">SAS</w:t>
       </w:r>
       <w:r>
-        <w:t xml:space="preserve"> is white on red when SAS is off.</w:t>
+        <w:t xml:space="preserve"> is white on red when SAS is off, except while the Landing Autopilot's vertical hold is flying, which turns SAS off on purpose: then the button reads </w:t>
+      </w:r>
+      <w:r>
+        <w:rPr>
+          <w:rFonts w:ascii="Consolas" w:cs="Consolas" w:eastAsia="Consolas" w:hAnsi="Consolas"/>
+        </w:rPr>
+        <w:t xml:space="preserve">VERT</w:t>
+      </w:r>
+      <w:r>
+        <w:t xml:space="preserve"> in green.</w:t>
       </w:r>
     </w:p>
     <w:p>
@@ -27425,7 +27434,7 @@
           <w:i/>
           <w:iCs/>
         </w:rPr>
-        <w:t xml:space="preserve">Holding −4 m/s on descent 310 m over the Mun, radial attitude reference.</w:t>
+        <w:t xml:space="preserve">Holding −4 m/s on descent 310 m over the Mun, ATT REF on VERT.</w:t>
       </w:r>
     </w:p>
     <w:p>
@@ -27532,7 +27541,69 @@
         <w:t xml:space="preserve">OPTIONS.</w:t>
       </w:r>
       <w:r>
-        <w:t xml:space="preserve"> ATT REF toggles RETRO (surface retrograde, kills horizontal speed) and RADIAL (straight up, a vertical descent). TWR overrides the thrust-to-weight used for BRAKE (0–20, or OFF to use the measured or estimated value, shown MEAS or EST). MARGIN adds metres to the ignition altitude (0–5,000). ROLL is the ENTRY roll angle.</w:t>
+        <w:t xml:space="preserve"> ATT REF toggles RETRO and VERT.</w:t>
+      </w:r>
+    </w:p>
+    <w:p>
+      <w:pPr>
+        <w:pStyle w:val="ListParagraph"/>
+        <w:numPr>
+          <w:ilvl w:val="1"/>
+          <w:numId w:val="2"/>
+        </w:numPr>
+        <w:spacing w:after="60"/>
+      </w:pPr>
+      <w:r>
+        <w:rPr>
+          <w:b/>
+          <w:bCs/>
+        </w:rPr>
+        <w:t xml:space="preserve">RETRO</w:t>
+      </w:r>
+      <w:r>
+        <w:t xml:space="preserve"> points the lander surface-retrograde with SAS, which in a descent is straight up and leans against any drift to cancel it. Near zero speed (a hover, or just before touchdown, below 1.5 m/s) it hands over to the vertical hold, and takes back above 3 m/s.</w:t>
+      </w:r>
+    </w:p>
+    <w:p>
+      <w:pPr>
+        <w:pStyle w:val="ListParagraph"/>
+        <w:numPr>
+          <w:ilvl w:val="1"/>
+          <w:numId w:val="2"/>
+        </w:numPr>
+        <w:spacing w:after="60"/>
+      </w:pPr>
+      <w:r>
+        <w:rPr>
+          <w:b/>
+          <w:bCs/>
+        </w:rPr>
+        <w:t xml:space="preserve">VERT</w:t>
+      </w:r>
+      <w:r>
+        <w:t xml:space="preserve"> holds the lander straight up at every speed, for a pure vertical descent; drift is yours to correct.</w:t>
+      </w:r>
+    </w:p>
+    <w:p>
+      <w:pPr>
+        <w:pStyle w:val="ListParagraph"/>
+        <w:numPr>
+          <w:ilvl w:val="1"/>
+          <w:numId w:val="2"/>
+        </w:numPr>
+        <w:spacing w:after="60"/>
+      </w:pPr>
+      <w:r>
+        <w:t xml:space="preserve">The vertical hold steers with the autopilot's own attitude loop and turns SAS off; the POWERED DESCENT SAS button then reads </w:t>
+      </w:r>
+      <w:r>
+        <w:rPr>
+          <w:rFonts w:ascii="Consolas" w:cs="Consolas" w:eastAsia="Consolas" w:hAnsi="Consolas"/>
+        </w:rPr>
+        <w:t xml:space="preserve">VERT</w:t>
+      </w:r>
+      <w:r>
+        <w:t xml:space="preserve"> in green. TWR overrides the thrust-to-weight used for BRAKE (0–20, or OFF to use the measured or estimated value, shown MEAS or EST). MARGIN adds metres to the ignition altitude (0–5,000). ROLL is the ENTRY roll angle.</w:t>
       </w:r>
     </w:p>
     <w:p>

</xml_diff>

<commit_message>
Autopilot summary frame 0xAA to both Info Displays (InfoDisp 1.16.3)
Controller_Main pushed autopilot status only for the console on screen and
only to Info Display 2, so off that console the mission ladder and the
console ring could not see an engaged autopilot. infodisp_link.ino now
writes an 8-byte summary (each console's flag byte, built by the same
helpers as the full frames, plus landing mode and ENTRY) to both displays
every 100 ms. I2CSlave.ino keeps it in its own buffer so it never displaces
a full frame and applies it after one; demo mode ignores it.

Host Wire stub gains a receive queue so harnesses can drive onReceive.
Docs: Mission_Autopilot.md 8.1, I2C spec 2.13, InfoDisp README, user
reference (and the landing A/P OFF throttle line, #82).

Fixes #83

Co-Authored-By: Claude Opus 5.5 <noreply@anthropic.com>
Claude-Session: https://claude.ai/code/session_01AfFKiY5R8Xk7jem2zcWdES
</commit_message>
<xml_diff>
--- a/Documents/User/Info_Display_Screen_Reference.docx
+++ b/Documents/User/Info_Display_Screen_Reference.docx
@@ -52,7 +52,7 @@
         <w:t xml:space="preserve">Applies to:</w:t>
       </w:r>
       <w:r>
-        <w:t xml:space="preserve"> KCMk1_InfoDisp firmware 1.16.2</w:t>
+        <w:t xml:space="preserve"> KCMk1_InfoDisp firmware 1.16.3</w:t>
       </w:r>
     </w:p>
     <w:p>
@@ -3887,7 +3887,7 @@
           <wp:inline distT="0" distB="0" distL="0" distR="0">
             <wp:extent cx="8782050" cy="5143500"/>
             <wp:effectExtent t="0" r="0" b="0" l="0"/>
-            <wp:docPr id="2" name="SPACECRAFT, 115 × 125 km Kerbin orbit" descr="SPACECRAFT, 115 × 125 km Kerbin orbit" title="SPACECRAFT, 115 × 125 km Kerbin orbit"/>
+            <wp:docPr id="1" name="SPACECRAFT, 115 × 125 km Kerbin orbit" descr="SPACECRAFT, 115 × 125 km Kerbin orbit" title="SPACECRAFT, 115 × 125 km Kerbin orbit"/>
             <wp:cNvGraphicFramePr>
               <a:graphicFrameLocks xmlns:a="http://schemas.openxmlformats.org/drawingml/2006/main" noChangeAspect="1"/>
             </wp:cNvGraphicFramePr>
@@ -6113,7 +6113,7 @@
           <wp:inline distT="0" distB="0" distL="0" distR="0">
             <wp:extent cx="8782050" cy="5143500"/>
             <wp:effectExtent t="0" r="0" b="0" l="0"/>
-            <wp:docPr id="3" name="AIRCRAFT, cruise at 4,500 m" descr="AIRCRAFT, cruise at 4,500 m" title="AIRCRAFT, cruise at 4,500 m"/>
+            <wp:docPr id="1" name="AIRCRAFT, cruise at 4,500 m" descr="AIRCRAFT, cruise at 4,500 m" title="AIRCRAFT, cruise at 4,500 m"/>
             <wp:cNvGraphicFramePr>
               <a:graphicFrameLocks xmlns:a="http://schemas.openxmlformats.org/drawingml/2006/main" noChangeAspect="1"/>
             </wp:cNvGraphicFramePr>
@@ -7871,7 +7871,7 @@
           <wp:inline distT="0" distB="0" distL="0" distR="0">
             <wp:extent cx="8782050" cy="5143500"/>
             <wp:effectExtent t="0" r="0" b="0" l="0"/>
-            <wp:docPr id="4" name="ROVER, driving to a target on the Mun" descr="ROVER, driving to a target on the Mun" title="ROVER, driving to a target on the Mun"/>
+            <wp:docPr id="1" name="ROVER, driving to a target on the Mun" descr="ROVER, driving to a target on the Mun" title="ROVER, driving to a target on the Mun"/>
             <wp:cNvGraphicFramePr>
               <a:graphicFrameLocks xmlns:a="http://schemas.openxmlformats.org/drawingml/2006/main" noChangeAspect="1"/>
             </wp:cNvGraphicFramePr>
@@ -9209,7 +9209,7 @@
           <wp:inline distT="0" distB="0" distL="0" distR="0">
             <wp:extent cx="8782050" cy="5143500"/>
             <wp:effectExtent t="0" r="0" b="0" l="0"/>
-            <wp:docPr id="5" name="VEHICLE INFO" descr="VEHICLE INFO" title="VEHICLE INFO"/>
+            <wp:docPr id="1" name="VEHICLE INFO" descr="VEHICLE INFO" title="VEHICLE INFO"/>
             <wp:cNvGraphicFramePr>
               <a:graphicFrameLocks xmlns:a="http://schemas.openxmlformats.org/drawingml/2006/main" noChangeAspect="1"/>
             </wp:cNvGraphicFramePr>
@@ -10280,7 +10280,7 @@
           <wp:inline distT="0" distB="0" distL="0" distR="0">
             <wp:extent cx="8782050" cy="5143500"/>
             <wp:effectExtent t="0" r="0" b="0" l="0"/>
-            <wp:docPr id="6" name="PRE-LAUNCH board" descr="PRE-LAUNCH board" title="PRE-LAUNCH board"/>
+            <wp:docPr id="1" name="PRE-LAUNCH board" descr="PRE-LAUNCH board" title="PRE-LAUNCH board"/>
             <wp:cNvGraphicFramePr>
               <a:graphicFrameLocks xmlns:a="http://schemas.openxmlformats.org/drawingml/2006/main" noChangeAspect="1"/>
             </wp:cNvGraphicFramePr>
@@ -11574,7 +11574,7 @@
           <wp:inline distT="0" distB="0" distL="0" distR="0">
             <wp:extent cx="8782050" cy="5143500"/>
             <wp:effectExtent t="0" r="0" b="0" l="0"/>
-            <wp:docPr id="7" name="ASCENT, 18.5 km into the gravity turn" descr="ASCENT, 18.5 km into the gravity turn" title="ASCENT, 18.5 km into the gravity turn"/>
+            <wp:docPr id="1" name="ASCENT, 18.5 km into the gravity turn" descr="ASCENT, 18.5 km into the gravity turn" title="ASCENT, 18.5 km into the gravity turn"/>
             <wp:cNvGraphicFramePr>
               <a:graphicFrameLocks xmlns:a="http://schemas.openxmlformats.org/drawingml/2006/main" noChangeAspect="1"/>
             </wp:cNvGraphicFramePr>
@@ -12620,7 +12620,7 @@
           <wp:inline distT="0" distB="0" distL="0" distR="0">
             <wp:extent cx="8782050" cy="5143500"/>
             <wp:effectExtent t="0" r="0" b="0" l="0"/>
-            <wp:docPr id="8" name="CIRCULARIZATION, coasting to apoapsis with a node placed" descr="CIRCULARIZATION, coasting to apoapsis with a node placed" title="CIRCULARIZATION, coasting to apoapsis with a node placed"/>
+            <wp:docPr id="1" name="CIRCULARIZATION, coasting to apoapsis with a node placed" descr="CIRCULARIZATION, coasting to apoapsis with a node placed" title="CIRCULARIZATION, coasting to apoapsis with a node placed"/>
             <wp:cNvGraphicFramePr>
               <a:graphicFrameLocks xmlns:a="http://schemas.openxmlformats.org/drawingml/2006/main" noChangeAspect="1"/>
             </wp:cNvGraphicFramePr>
@@ -14111,7 +14111,7 @@
           <wp:inline distT="0" distB="0" distL="0" distR="0">
             <wp:extent cx="8782050" cy="5143500"/>
             <wp:effectExtent t="0" r="0" b="0" l="0"/>
-            <wp:docPr id="9" name="ORBIT, 115 × 125 km, 6° inclination" descr="ORBIT, 115 × 125 km, 6° inclination" title="ORBIT, 115 × 125 km, 6° inclination"/>
+            <wp:docPr id="1" name="ORBIT, 115 × 125 km, 6° inclination" descr="ORBIT, 115 × 125 km, 6° inclination" title="ORBIT, 115 × 125 km, 6° inclination"/>
             <wp:cNvGraphicFramePr>
               <a:graphicFrameLocks xmlns:a="http://schemas.openxmlformats.org/drawingml/2006/main" noChangeAspect="1"/>
             </wp:cNvGraphicFramePr>
@@ -15441,7 +15441,7 @@
           <wp:inline distT="0" distB="0" distL="0" distR="0">
             <wp:extent cx="8782050" cy="5143500"/>
             <wp:effectExtent t="0" r="0" b="0" l="0"/>
-            <wp:docPr id="10" name="ORBIT ADVANCED" descr="ORBIT ADVANCED" title="ORBIT ADVANCED"/>
+            <wp:docPr id="1" name="ORBIT ADVANCED" descr="ORBIT ADVANCED" title="ORBIT ADVANCED"/>
             <wp:cNvGraphicFramePr>
               <a:graphicFrameLocks xmlns:a="http://schemas.openxmlformats.org/drawingml/2006/main" noChangeAspect="1"/>
             </wp:cNvGraphicFramePr>
@@ -17032,7 +17032,7 @@
           <wp:inline distT="0" distB="0" distL="0" distR="0">
             <wp:extent cx="8782050" cy="5143500"/>
             <wp:effectExtent t="0" r="0" b="0" l="0"/>
-            <wp:docPr id="11" name="MANEUVER, aligned with an 842 m/s node" descr="MANEUVER, aligned with an 842 m/s node" title="MANEUVER, aligned with an 842 m/s node"/>
+            <wp:docPr id="1" name="MANEUVER, aligned with an 842 m/s node" descr="MANEUVER, aligned with an 842 m/s node" title="MANEUVER, aligned with an 842 m/s node"/>
             <wp:cNvGraphicFramePr>
               <a:graphicFrameLocks xmlns:a="http://schemas.openxmlformats.org/drawingml/2006/main" noChangeAspect="1"/>
             </wp:cNvGraphicFramePr>
@@ -18159,7 +18159,7 @@
           <wp:inline distT="0" distB="0" distL="0" distR="0">
             <wp:extent cx="8782050" cy="5143500"/>
             <wp:effectExtent t="0" r="0" b="0" l="0"/>
-            <wp:docPr id="12" name="TARGET, 1,250 m from the target and closing" descr="TARGET, 1,250 m from the target and closing" title="TARGET, 1,250 m from the target and closing"/>
+            <wp:docPr id="1" name="TARGET, 1,250 m from the target and closing" descr="TARGET, 1,250 m from the target and closing" title="TARGET, 1,250 m from the target and closing"/>
             <wp:cNvGraphicFramePr>
               <a:graphicFrameLocks xmlns:a="http://schemas.openxmlformats.org/drawingml/2006/main" noChangeAspect="1"/>
             </wp:cNvGraphicFramePr>
@@ -19178,7 +19178,7 @@
           <wp:inline distT="0" distB="0" distL="0" distR="0">
             <wp:extent cx="8782050" cy="5143500"/>
             <wp:effectExtent t="0" r="0" b="0" l="0"/>
-            <wp:docPr id="13" name="DOCKING, 42 m from the port" descr="DOCKING, 42 m from the port" title="DOCKING, 42 m from the port"/>
+            <wp:docPr id="1" name="DOCKING, 42 m from the port" descr="DOCKING, 42 m from the port" title="DOCKING, 42 m from the port"/>
             <wp:cNvGraphicFramePr>
               <a:graphicFrameLocks xmlns:a="http://schemas.openxmlformats.org/drawingml/2006/main" noChangeAspect="1"/>
             </wp:cNvGraphicFramePr>
@@ -20463,7 +20463,7 @@
           <wp:inline distT="0" distB="0" distL="0" distR="0">
             <wp:extent cx="8782050" cy="5143500"/>
             <wp:effectExtent t="0" r="0" b="0" l="0"/>
-            <wp:docPr id="14" name="NAVIGATION, heading 270° with a target ahead" descr="NAVIGATION, heading 270° with a target ahead" title="NAVIGATION, heading 270° with a target ahead"/>
+            <wp:docPr id="1" name="NAVIGATION, heading 270° with a target ahead" descr="NAVIGATION, heading 270° with a target ahead" title="NAVIGATION, heading 270° with a target ahead"/>
             <wp:cNvGraphicFramePr>
               <a:graphicFrameLocks xmlns:a="http://schemas.openxmlformats.org/drawingml/2006/main" noChangeAspect="1"/>
             </wp:cNvGraphicFramePr>
@@ -21596,7 +21596,7 @@
           <wp:inline distT="0" distB="0" distL="0" distR="0">
             <wp:extent cx="8782050" cy="5143500"/>
             <wp:effectExtent t="0" r="0" b="0" l="0"/>
-            <wp:docPr id="15" name="POWERED DESCENT, 310 m over the Mun" descr="POWERED DESCENT, 310 m over the Mun" title="POWERED DESCENT, 310 m over the Mun"/>
+            <wp:docPr id="1" name="POWERED DESCENT, 310 m over the Mun" descr="POWERED DESCENT, 310 m over the Mun" title="POWERED DESCENT, 310 m over the Mun"/>
             <wp:cNvGraphicFramePr>
               <a:graphicFrameLocks xmlns:a="http://schemas.openxmlformats.org/drawingml/2006/main" noChangeAspect="1"/>
             </wp:cNvGraphicFramePr>
@@ -22775,7 +22775,7 @@
           <wp:inline distT="0" distB="0" distL="0" distR="0">
             <wp:extent cx="8782050" cy="5143500"/>
             <wp:effectExtent t="0" r="0" b="0" l="0"/>
-            <wp:docPr id="16" name="RE-ENTRY, Kerbin entry at Mach 6.9" descr="RE-ENTRY, Kerbin entry at Mach 6.9" title="RE-ENTRY, Kerbin entry at Mach 6.9"/>
+            <wp:docPr id="1" name="RE-ENTRY, Kerbin entry at Mach 6.9" descr="RE-ENTRY, Kerbin entry at Mach 6.9" title="RE-ENTRY, Kerbin entry at Mach 6.9"/>
             <wp:cNvGraphicFramePr>
               <a:graphicFrameLocks xmlns:a="http://schemas.openxmlformats.org/drawingml/2006/main" noChangeAspect="1"/>
             </wp:cNvGraphicFramePr>
@@ -25257,7 +25257,7 @@
           <wp:inline distT="0" distB="0" distL="0" distR="0">
             <wp:extent cx="8782050" cy="5143500"/>
             <wp:effectExtent t="0" r="0" b="0" l="0"/>
-            <wp:docPr id="17" name="ASCENT AUTOPILOT, armed, in the gravity turn" descr="ASCENT AUTOPILOT, armed, in the gravity turn" title="ASCENT AUTOPILOT, armed, in the gravity turn"/>
+            <wp:docPr id="1" name="ASCENT AUTOPILOT, armed, in the gravity turn" descr="ASCENT AUTOPILOT, armed, in the gravity turn" title="ASCENT AUTOPILOT, armed, in the gravity turn"/>
             <wp:cNvGraphicFramePr>
               <a:graphicFrameLocks xmlns:a="http://schemas.openxmlformats.org/drawingml/2006/main" noChangeAspect="1"/>
             </wp:cNvGraphicFramePr>
@@ -26243,7 +26243,7 @@
           <wp:inline distT="0" distB="0" distL="0" distR="0">
             <wp:extent cx="8782050" cy="5143500"/>
             <wp:effectExtent t="0" r="0" b="0" l="0"/>
-            <wp:docPr id="18" name="ORBITAL AUTOPILOT, node burn planned" descr="ORBITAL AUTOPILOT, node burn planned" title="ORBITAL AUTOPILOT, node burn planned"/>
+            <wp:docPr id="1" name="ORBITAL AUTOPILOT, node burn planned" descr="ORBITAL AUTOPILOT, node burn planned" title="ORBITAL AUTOPILOT, node burn planned"/>
             <wp:cNvGraphicFramePr>
               <a:graphicFrameLocks xmlns:a="http://schemas.openxmlformats.org/drawingml/2006/main" noChangeAspect="1"/>
             </wp:cNvGraphicFramePr>
@@ -27449,7 +27449,7 @@
           <wp:inline distT="0" distB="0" distL="0" distR="0">
             <wp:extent cx="8782050" cy="5143500"/>
             <wp:effectExtent t="0" r="0" b="0" l="0"/>
-            <wp:docPr id="19" name="LANDING AUTOPILOT, descent-rate hold over the Mun" descr="LANDING AUTOPILOT, descent-rate hold over the Mun" title="LANDING AUTOPILOT, descent-rate hold over the Mun"/>
+            <wp:docPr id="1" name="LANDING AUTOPILOT, descent-rate hold over the Mun" descr="LANDING AUTOPILOT, descent-rate hold over the Mun" title="LANDING AUTOPILOT, descent-rate hold over the Mun"/>
             <wp:cNvGraphicFramePr>
               <a:graphicFrameLocks xmlns:a="http://schemas.openxmlformats.org/drawingml/2006/main" noChangeAspect="1"/>
             </wp:cNvGraphicFramePr>
@@ -27723,7 +27723,7 @@
         <w:t xml:space="preserve">A/P OFF.</w:t>
       </w:r>
       <w:r>
-        <w:t xml:space="preserve"> Disconnects everything. If DESC, HOVR or BRAKE was flying, the throttle is cut to zero.</w:t>
+        <w:t xml:space="preserve"> Disconnects everything. The throttle is left where it is, so a hover handed back to you keeps its thrust.</w:t>
       </w:r>
     </w:p>
     <w:p>
@@ -28672,7 +28672,7 @@
           <wp:inline distT="0" distB="0" distL="0" distR="0">
             <wp:extent cx="8782050" cy="5143500"/>
             <wp:effectExtent t="0" r="0" b="0" l="0"/>
-            <wp:docPr id="20" name="AIRCRAFT AUTOPILOT, ALT + HDG + IAS cruise" descr="AIRCRAFT AUTOPILOT, ALT + HDG + IAS cruise" title="AIRCRAFT AUTOPILOT, ALT + HDG + IAS cruise"/>
+            <wp:docPr id="1" name="AIRCRAFT AUTOPILOT, ALT + HDG + IAS cruise" descr="AIRCRAFT AUTOPILOT, ALT + HDG + IAS cruise" title="AIRCRAFT AUTOPILOT, ALT + HDG + IAS cruise"/>
             <wp:cNvGraphicFramePr>
               <a:graphicFrameLocks xmlns:a="http://schemas.openxmlformats.org/drawingml/2006/main" noChangeAspect="1"/>
             </wp:cNvGraphicFramePr>
@@ -29808,7 +29808,7 @@
           <wp:inline distT="0" distB="0" distL="0" distR="0">
             <wp:extent cx="8782050" cy="5143500"/>
             <wp:effectExtent t="0" r="0" b="0" l="0"/>
-            <wp:docPr id="21" name="ROVER AUTOPILOT, cruise and heading hold" descr="ROVER AUTOPILOT, cruise and heading hold" title="ROVER AUTOPILOT, cruise and heading hold"/>
+            <wp:docPr id="1" name="ROVER AUTOPILOT, cruise and heading hold" descr="ROVER AUTOPILOT, cruise and heading hold" title="ROVER AUTOPILOT, cruise and heading hold"/>
             <wp:cNvGraphicFramePr>
               <a:graphicFrameLocks xmlns:a="http://schemas.openxmlformats.org/drawingml/2006/main" noChangeAspect="1"/>
             </wp:cNvGraphicFramePr>
@@ -30933,6 +30933,10 @@
 </w:document>
 </file>
 
+<file path=word/comments.xml><?xml version="1.0" encoding="utf-8"?>
+<w:comments xmlns:cx="http://schemas.microsoft.com/office/drawing/2014/chartex" xmlns:cx1="http://schemas.microsoft.com/office/drawing/2015/9/8/chartex" xmlns:cx2="http://schemas.microsoft.com/office/drawing/2015/10/21/chartex" xmlns:cx3="http://schemas.microsoft.com/office/drawing/2016/5/9/chartex" xmlns:cx4="http://schemas.microsoft.com/office/drawing/2016/5/10/chartex" xmlns:cx5="http://schemas.microsoft.com/office/drawing/2016/5/11/chartex" xmlns:cx6="http://schemas.microsoft.com/office/drawing/2016/5/12/chartex" xmlns:cx7="http://schemas.microsoft.com/office/drawing/2016/5/13/chartex" xmlns:cx8="http://schemas.microsoft.com/office/drawing/2016/5/14/chartex" xmlns:mc="http://schemas.openxmlformats.org/markup-compatibility/2006" xmlns:aink="http://schemas.microsoft.com/office/drawing/2016/ink" xmlns:am3d="http://schemas.microsoft.com/office/drawing/2017/model3d" xmlns:o="urn:schemas-microsoft-com:office:office" xmlns:r="http://schemas.openxmlformats.org/officeDocument/2006/relationships" xmlns:m="http://schemas.openxmlformats.org/officeDocument/2006/math" xmlns:v="urn:schemas-microsoft-com:vml" xmlns:wp14="http://schemas.microsoft.com/office/word/2010/wordprocessingDrawing" xmlns:wp="http://schemas.openxmlformats.org/drawingml/2006/wordprocessingDrawing" xmlns:w10="urn:schemas-microsoft-com:office:word" xmlns:w="http://schemas.openxmlformats.org/wordprocessingml/2006/main" xmlns:w14="http://schemas.microsoft.com/office/word/2010/wordml" xmlns:w15="http://schemas.microsoft.com/office/word/2012/wordml" xmlns:w16cex="http://schemas.microsoft.com/office/word/2018/wordml/cex" xmlns:w16cid="http://schemas.microsoft.com/office/word/2016/wordml/cid" xmlns:w16="http://schemas.microsoft.com/office/word/2018/wordml" xmlns:w16sdtdh="http://schemas.microsoft.com/office/word/2020/wordml/sdtdatahash" xmlns:w16se="http://schemas.microsoft.com/office/word/2015/wordml/symex" xmlns:wpg="http://schemas.microsoft.com/office/word/2010/wordprocessingGroup" xmlns:wpi="http://schemas.microsoft.com/office/word/2010/wordprocessingInk" xmlns:wne="http://schemas.microsoft.com/office/word/2006/wordml" xmlns:wps="http://schemas.microsoft.com/office/word/2010/wordprocessingShape"/>
+</file>
+
 <file path=word/endnotes.xml><?xml version="1.0" encoding="utf-8"?>
 <w:endnotes xmlns:wpc="http://schemas.microsoft.com/office/word/2010/wordprocessingCanvas" xmlns:mc="http://schemas.openxmlformats.org/markup-compatibility/2006" xmlns:o="urn:schemas-microsoft-com:office:office" xmlns:r="http://schemas.openxmlformats.org/officeDocument/2006/relationships" xmlns:m="http://schemas.openxmlformats.org/officeDocument/2006/math" xmlns:v="urn:schemas-microsoft-com:vml" xmlns:wp14="http://schemas.microsoft.com/office/word/2010/wordprocessingDrawing" xmlns:wp="http://schemas.openxmlformats.org/drawingml/2006/wordprocessingDrawing" xmlns:w10="urn:schemas-microsoft-com:office:word" xmlns:w="http://schemas.openxmlformats.org/wordprocessingml/2006/main" xmlns:w14="http://schemas.microsoft.com/office/word/2010/wordml" xmlns:w15="http://schemas.microsoft.com/office/word/2012/wordml" xmlns:wpg="http://schemas.microsoft.com/office/word/2010/wordprocessingGroup" xmlns:wpi="http://schemas.microsoft.com/office/word/2010/wordprocessingInk" xmlns:wne="http://schemas.microsoft.com/office/word/2006/wordml" xmlns:wps="http://schemas.microsoft.com/office/word/2010/wordprocessingShape" mc:Ignorable="w14 w15 wp14">
   <w:endnote w:type="separator" w:id="-1">
@@ -31011,7 +31015,7 @@
 <w:numbering xmlns:wpc="http://schemas.microsoft.com/office/word/2010/wordprocessingCanvas" xmlns:mc="http://schemas.openxmlformats.org/markup-compatibility/2006" xmlns:o="urn:schemas-microsoft-com:office:office" xmlns:r="http://schemas.openxmlformats.org/officeDocument/2006/relationships" xmlns:m="http://schemas.openxmlformats.org/officeDocument/2006/math" xmlns:v="urn:schemas-microsoft-com:vml" xmlns:wp14="http://schemas.microsoft.com/office/word/2010/wordprocessingDrawing" xmlns:wp="http://schemas.openxmlformats.org/drawingml/2006/wordprocessingDrawing" xmlns:w10="urn:schemas-microsoft-com:office:word" xmlns:w="http://schemas.openxmlformats.org/wordprocessingml/2006/main" xmlns:w14="http://schemas.microsoft.com/office/word/2010/wordml" xmlns:w15="http://schemas.microsoft.com/office/word/2012/wordml" xmlns:wpg="http://schemas.microsoft.com/office/word/2010/wordprocessingGroup" xmlns:wpi="http://schemas.microsoft.com/office/word/2010/wordprocessingInk" xmlns:wne="http://schemas.microsoft.com/office/word/2006/wordml" xmlns:wps="http://schemas.microsoft.com/office/word/2010/wordprocessingShape" mc:Ignorable="w14 w15 wp14">
   <w:abstractNum w:abstractNumId="1" w15:restartNumberingAfterBreak="0">
     <w:multiLevelType w:val="hybridMultilevel"/>
-    <w:lvl w:ilvl="0" w:tentative="1">
+    <w:lvl w:ilvl="0" w15:tentative="1">
       <w:start w:val="1"/>
       <w:numFmt w:val="bullet"/>
       <w:lvlText w:val="●"/>
@@ -31020,7 +31024,7 @@
         <w:ind w:left="720" w:hanging="360"/>
       </w:pPr>
     </w:lvl>
-    <w:lvl w:ilvl="1" w:tentative="1">
+    <w:lvl w:ilvl="1" w15:tentative="1">
       <w:start w:val="1"/>
       <w:numFmt w:val="bullet"/>
       <w:lvlText w:val="○"/>
@@ -31029,7 +31033,7 @@
         <w:ind w:left="1440" w:hanging="360"/>
       </w:pPr>
     </w:lvl>
-    <w:lvl w:ilvl="2" w:tentative="1">
+    <w:lvl w:ilvl="2" w15:tentative="1">
       <w:start w:val="1"/>
       <w:numFmt w:val="bullet"/>
       <w:lvlText w:val="■"/>
@@ -31038,7 +31042,7 @@
         <w:ind w:left="2160" w:hanging="360"/>
       </w:pPr>
     </w:lvl>
-    <w:lvl w:ilvl="3" w:tentative="1">
+    <w:lvl w:ilvl="3" w15:tentative="1">
       <w:start w:val="1"/>
       <w:numFmt w:val="bullet"/>
       <w:lvlText w:val="●"/>
@@ -31047,7 +31051,7 @@
         <w:ind w:left="2880" w:hanging="360"/>
       </w:pPr>
     </w:lvl>
-    <w:lvl w:ilvl="4" w:tentative="1">
+    <w:lvl w:ilvl="4" w15:tentative="1">
       <w:start w:val="1"/>
       <w:numFmt w:val="bullet"/>
       <w:lvlText w:val="○"/>
@@ -31056,7 +31060,7 @@
         <w:ind w:left="3600" w:hanging="360"/>
       </w:pPr>
     </w:lvl>
-    <w:lvl w:ilvl="5" w:tentative="1">
+    <w:lvl w:ilvl="5" w15:tentative="1">
       <w:start w:val="1"/>
       <w:numFmt w:val="bullet"/>
       <w:lvlText w:val="■"/>
@@ -31065,7 +31069,7 @@
         <w:ind w:left="4320" w:hanging="360"/>
       </w:pPr>
     </w:lvl>
-    <w:lvl w:ilvl="6" w:tentative="1">
+    <w:lvl w:ilvl="6" w15:tentative="1">
       <w:start w:val="1"/>
       <w:numFmt w:val="bullet"/>
       <w:lvlText w:val="●"/>
@@ -31074,7 +31078,7 @@
         <w:ind w:left="5040" w:hanging="360"/>
       </w:pPr>
     </w:lvl>
-    <w:lvl w:ilvl="7" w:tentative="1">
+    <w:lvl w:ilvl="7" w15:tentative="1">
       <w:start w:val="1"/>
       <w:numFmt w:val="bullet"/>
       <w:lvlText w:val="●"/>
@@ -31083,7 +31087,7 @@
         <w:ind w:left="5760" w:hanging="360"/>
       </w:pPr>
     </w:lvl>
-    <w:lvl w:ilvl="8" w:tentative="1">
+    <w:lvl w:ilvl="8" w15:tentative="1">
       <w:start w:val="1"/>
       <w:numFmt w:val="bullet"/>
       <w:lvlText w:val="●"/>
@@ -31095,7 +31099,7 @@
   </w:abstractNum>
   <w:abstractNum w:abstractNumId="2" w15:restartNumberingAfterBreak="0">
     <w:multiLevelType w:val="hybridMultilevel"/>
-    <w:lvl w:ilvl="0" w:tentative="1">
+    <w:lvl w:ilvl="0" w15:tentative="1">
       <w:start w:val="1"/>
       <w:numFmt w:val="bullet"/>
       <w:lvlText w:val="•"/>
@@ -31104,7 +31108,7 @@
         <w:ind w:left="567" w:hanging="283"/>
       </w:pPr>
     </w:lvl>
-    <w:lvl w:ilvl="1" w:tentative="1">
+    <w:lvl w:ilvl="1" w15:tentative="1">
       <w:start w:val="1"/>
       <w:numFmt w:val="bullet"/>
       <w:lvlText w:val="–"/>
@@ -31116,7 +31120,7 @@
   </w:abstractNum>
   <w:abstractNum w:abstractNumId="3" w15:restartNumberingAfterBreak="0">
     <w:multiLevelType w:val="hybridMultilevel"/>
-    <w:lvl w:ilvl="0" w:tentative="1">
+    <w:lvl w:ilvl="0" w15:tentative="1">
       <w:start w:val="1"/>
       <w:numFmt w:val="decimal"/>
       <w:lvlText w:val="%1."/>
@@ -31125,7 +31129,7 @@
         <w:ind w:left="567" w:hanging="340"/>
       </w:pPr>
     </w:lvl>
-    <w:lvl w:ilvl="1" w:tentative="1">
+    <w:lvl w:ilvl="1" w15:tentative="1">
       <w:start w:val="1"/>
       <w:numFmt w:val="lowerLetter"/>
       <w:lvlText w:val="%2."/>
@@ -31146,16 +31150,10 @@
     <w:lvlOverride w:ilvl="0">
       <w:startOverride w:val="1"/>
     </w:lvlOverride>
-    <w:lvlOverride w:ilvl="1">
-      <w:startOverride w:val="1"/>
-    </w:lvlOverride>
   </w:num>
   <w:num w:numId="3">
     <w:abstractNumId w:val="3"/>
     <w:lvlOverride w:ilvl="0">
-      <w:startOverride w:val="1"/>
-    </w:lvlOverride>
-    <w:lvlOverride w:ilvl="1">
       <w:startOverride w:val="1"/>
     </w:lvlOverride>
   </w:num>
@@ -31164,16 +31162,10 @@
     <w:lvlOverride w:ilvl="0">
       <w:startOverride w:val="1"/>
     </w:lvlOverride>
-    <w:lvlOverride w:ilvl="1">
-      <w:startOverride w:val="1"/>
-    </w:lvlOverride>
   </w:num>
   <w:num w:numId="5">
     <w:abstractNumId w:val="3"/>
     <w:lvlOverride w:ilvl="0">
-      <w:startOverride w:val="1"/>
-    </w:lvlOverride>
-    <w:lvlOverride w:ilvl="1">
       <w:startOverride w:val="1"/>
     </w:lvlOverride>
   </w:num>
@@ -31182,16 +31174,10 @@
     <w:lvlOverride w:ilvl="0">
       <w:startOverride w:val="1"/>
     </w:lvlOverride>
-    <w:lvlOverride w:ilvl="1">
-      <w:startOverride w:val="1"/>
-    </w:lvlOverride>
   </w:num>
   <w:num w:numId="7">
     <w:abstractNumId w:val="3"/>
     <w:lvlOverride w:ilvl="0">
-      <w:startOverride w:val="1"/>
-    </w:lvlOverride>
-    <w:lvlOverride w:ilvl="1">
       <w:startOverride w:val="1"/>
     </w:lvlOverride>
   </w:num>
@@ -31200,16 +31186,10 @@
     <w:lvlOverride w:ilvl="0">
       <w:startOverride w:val="1"/>
     </w:lvlOverride>
-    <w:lvlOverride w:ilvl="1">
-      <w:startOverride w:val="1"/>
-    </w:lvlOverride>
   </w:num>
   <w:num w:numId="9">
     <w:abstractNumId w:val="3"/>
     <w:lvlOverride w:ilvl="0">
-      <w:startOverride w:val="1"/>
-    </w:lvlOverride>
-    <w:lvlOverride w:ilvl="1">
       <w:startOverride w:val="1"/>
     </w:lvlOverride>
   </w:num>
@@ -31218,16 +31198,10 @@
     <w:lvlOverride w:ilvl="0">
       <w:startOverride w:val="1"/>
     </w:lvlOverride>
-    <w:lvlOverride w:ilvl="1">
-      <w:startOverride w:val="1"/>
-    </w:lvlOverride>
   </w:num>
   <w:num w:numId="11">
     <w:abstractNumId w:val="3"/>
     <w:lvlOverride w:ilvl="0">
-      <w:startOverride w:val="1"/>
-    </w:lvlOverride>
-    <w:lvlOverride w:ilvl="1">
       <w:startOverride w:val="1"/>
     </w:lvlOverride>
   </w:num>
@@ -31236,16 +31210,10 @@
     <w:lvlOverride w:ilvl="0">
       <w:startOverride w:val="1"/>
     </w:lvlOverride>
-    <w:lvlOverride w:ilvl="1">
-      <w:startOverride w:val="1"/>
-    </w:lvlOverride>
   </w:num>
   <w:num w:numId="13">
     <w:abstractNumId w:val="3"/>
     <w:lvlOverride w:ilvl="0">
-      <w:startOverride w:val="1"/>
-    </w:lvlOverride>
-    <w:lvlOverride w:ilvl="1">
       <w:startOverride w:val="1"/>
     </w:lvlOverride>
   </w:num>
@@ -31254,16 +31222,10 @@
     <w:lvlOverride w:ilvl="0">
       <w:startOverride w:val="1"/>
     </w:lvlOverride>
-    <w:lvlOverride w:ilvl="1">
-      <w:startOverride w:val="1"/>
-    </w:lvlOverride>
   </w:num>
   <w:num w:numId="15">
     <w:abstractNumId w:val="3"/>
     <w:lvlOverride w:ilvl="0">
-      <w:startOverride w:val="1"/>
-    </w:lvlOverride>
-    <w:lvlOverride w:ilvl="1">
       <w:startOverride w:val="1"/>
     </w:lvlOverride>
   </w:num>
@@ -31282,25 +31244,6 @@
     </w:rPrDefault>
     <w:pPrDefault/>
   </w:docDefaults>
-  <w:style w:type="paragraph" w:styleId="Normal" w:default="1">
-    <w:name w:val="Normal"/>
-    <w:qFormat/>
-  </w:style>
-  <w:style w:type="table" w:styleId="TableNormal" w:default="true">
-    <w:name w:val="Normal Table"/>
-    <w:uiPriority w:val="99"/>
-    <w:semiHidden/>
-    <w:unhideWhenUsed/>
-    <w:tblPr>
-      <w:tblInd w:type="dxa" w:w="0"/>
-      <w:tblCellMar>
-        <w:top w:type="dxa" w:w="0"/>
-        <w:left w:type="dxa" w:w="108"/>
-        <w:bottom w:type="dxa" w:w="0"/>
-        <w:right w:type="dxa" w:w="108"/>
-      </w:tblCellMar>
-    </w:tblPr>
-  </w:style>
   <w:style w:type="paragraph" w:styleId="Title">
     <w:name w:val="Title"/>
     <w:basedOn w:val="Normal"/>
@@ -31388,139 +31331,6 @@
     <w:basedOn w:val="Normal"/>
     <w:qFormat/>
   </w:style>
-  <w:style w:type="paragraph" w:styleId="Caption">
-    <w:name w:val="caption"/>
-    <w:basedOn w:val="Normal"/>
-    <w:next w:val="Normal"/>
-    <w:uiPriority w:val="35"/>
-    <w:semiHidden/>
-    <w:unhideWhenUsed/>
-    <w:qFormat/>
-    <w:pPr>
-      <w:spacing w:after="200"/>
-    </w:pPr>
-    <w:rPr>
-      <w:i/>
-      <w:iCs/>
-      <w:color w:val="44546A" w:themeColor="dark2"/>
-      <w:sz w:val="18"/>
-      <w:szCs w:val="18"/>
-    </w:rPr>
-  </w:style>
-  <w:style w:type="paragraph" w:styleId="Bibliography">
-    <w:name w:val="Bibliography"/>
-    <w:basedOn w:val="Normal"/>
-    <w:next w:val="Normal"/>
-    <w:uiPriority w:val="37"/>
-    <w:unhideWhenUsed/>
-  </w:style>
-  <w:style w:type="paragraph" w:styleId="TOC1">
-    <w:name w:val="toc 1"/>
-    <w:basedOn w:val="Normal"/>
-    <w:next w:val="Normal"/>
-    <w:uiPriority w:val="39"/>
-    <w:semiHidden/>
-    <w:unhideWhenUsed/>
-    <w:pPr>
-      <w:spacing w:after="100"/>
-    </w:pPr>
-  </w:style>
-  <w:style w:type="paragraph" w:styleId="TOC2">
-    <w:name w:val="toc 2"/>
-    <w:basedOn w:val="Normal"/>
-    <w:next w:val="Normal"/>
-    <w:uiPriority w:val="39"/>
-    <w:semiHidden/>
-    <w:unhideWhenUsed/>
-    <w:pPr>
-      <w:spacing w:after="100"/>
-      <w:ind w:left="210"/>
-    </w:pPr>
-  </w:style>
-  <w:style w:type="paragraph" w:styleId="TOC3">
-    <w:name w:val="toc 3"/>
-    <w:basedOn w:val="Normal"/>
-    <w:next w:val="Normal"/>
-    <w:uiPriority w:val="39"/>
-    <w:semiHidden/>
-    <w:unhideWhenUsed/>
-    <w:pPr>
-      <w:spacing w:after="100"/>
-      <w:ind w:left="420"/>
-    </w:pPr>
-  </w:style>
-  <w:style w:type="paragraph" w:styleId="TOC4">
-    <w:name w:val="toc 4"/>
-    <w:basedOn w:val="Normal"/>
-    <w:next w:val="Normal"/>
-    <w:uiPriority w:val="39"/>
-    <w:semiHidden/>
-    <w:unhideWhenUsed/>
-    <w:pPr>
-      <w:spacing w:after="100"/>
-      <w:ind w:left="630"/>
-    </w:pPr>
-  </w:style>
-  <w:style w:type="paragraph" w:styleId="TOC5">
-    <w:name w:val="toc 5"/>
-    <w:basedOn w:val="Normal"/>
-    <w:next w:val="Normal"/>
-    <w:uiPriority w:val="39"/>
-    <w:semiHidden/>
-    <w:unhideWhenUsed/>
-    <w:pPr>
-      <w:spacing w:after="100"/>
-      <w:ind w:left="840"/>
-    </w:pPr>
-  </w:style>
-  <w:style w:type="paragraph" w:styleId="TOC6">
-    <w:name w:val="toc 6"/>
-    <w:basedOn w:val="Normal"/>
-    <w:next w:val="Normal"/>
-    <w:uiPriority w:val="39"/>
-    <w:semiHidden/>
-    <w:unhideWhenUsed/>
-    <w:pPr>
-      <w:spacing w:after="100"/>
-      <w:ind w:left="1050"/>
-    </w:pPr>
-  </w:style>
-  <w:style w:type="paragraph" w:styleId="TOC7">
-    <w:name w:val="toc 7"/>
-    <w:basedOn w:val="Normal"/>
-    <w:next w:val="Normal"/>
-    <w:uiPriority w:val="39"/>
-    <w:semiHidden/>
-    <w:unhideWhenUsed/>
-    <w:pPr>
-      <w:spacing w:after="100"/>
-      <w:ind w:left="1260"/>
-    </w:pPr>
-  </w:style>
-  <w:style w:type="paragraph" w:styleId="TOC8">
-    <w:name w:val="toc 8"/>
-    <w:basedOn w:val="Normal"/>
-    <w:next w:val="Normal"/>
-    <w:uiPriority w:val="39"/>
-    <w:semiHidden/>
-    <w:unhideWhenUsed/>
-    <w:pPr>
-      <w:spacing w:after="100"/>
-      <w:ind w:left="1470"/>
-    </w:pPr>
-  </w:style>
-  <w:style w:type="paragraph" w:styleId="TOC9">
-    <w:name w:val="toc 9"/>
-    <w:basedOn w:val="Normal"/>
-    <w:next w:val="Normal"/>
-    <w:uiPriority w:val="39"/>
-    <w:semiHidden/>
-    <w:unhideWhenUsed/>
-    <w:pPr>
-      <w:spacing w:after="100"/>
-      <w:ind w:left="1680"/>
-    </w:pPr>
-  </w:style>
   <w:style w:type="character" w:styleId="Hyperlink">
     <w:name w:val="Hyperlink"/>
     <w:basedOn w:val="DefaultParagraphFont"/>
@@ -31605,302 +31415,5 @@
       <w:szCs w:val="20"/>
     </w:rPr>
   </w:style>
-  <w:style w:type="character" w:styleId="LineNumber">
-    <w:name w:val="line number"/>
-    <w:basedOn w:val="DefaultParagraphFont"/>
-    <w:uiPriority w:val="99"/>
-    <w:semiHidden/>
-    <w:unhideWhenUsed/>
-  </w:style>
 </w:styles>
-</file>
-
-<file path=word/theme/theme1.xml><?xml version="1.0" encoding="utf-8"?>
-<a:theme xmlns:a="http://schemas.openxmlformats.org/drawingml/2006/main" name="Office Theme">
-  <a:themeElements>
-    <a:clrScheme name="Office">
-      <a:dk1>
-        <a:sysClr val="windowText" lastClr="000000"/>
-      </a:dk1>
-      <a:lt1>
-        <a:sysClr val="window" lastClr="FFFFFF"/>
-      </a:lt1>
-      <a:dk2>
-        <a:srgbClr val="44546A"/>
-      </a:dk2>
-      <a:lt2>
-        <a:srgbClr val="E7E6E6"/>
-      </a:lt2>
-      <a:accent1>
-        <a:srgbClr val="4472C4"/>
-      </a:accent1>
-      <a:accent2>
-        <a:srgbClr val="ED7D31"/>
-      </a:accent2>
-      <a:accent3>
-        <a:srgbClr val="A5A5A5"/>
-      </a:accent3>
-      <a:accent4>
-        <a:srgbClr val="FFC000"/>
-      </a:accent4>
-      <a:accent5>
-        <a:srgbClr val="5B9BD5"/>
-      </a:accent5>
-      <a:accent6>
-        <a:srgbClr val="70AD47"/>
-      </a:accent6>
-      <a:hlink>
-        <a:srgbClr val="0563C1"/>
-      </a:hlink>
-      <a:folHlink>
-        <a:srgbClr val="954F72"/>
-      </a:folHlink>
-    </a:clrScheme>
-    <a:fontScheme name="Office">
-      <a:majorFont>
-        <a:latin typeface="Calibri Light" panose="020F0302020204030204"/>
-        <a:ea typeface=""/>
-        <a:cs typeface=""/>
-        <a:font script="Jpan" typeface="游ゴシック Light"/>
-        <a:font script="Hang" typeface="맑은 고딕"/>
-        <a:font script="Hans" typeface="等线 Light"/>
-        <a:font script="Hant" typeface="新細明體"/>
-        <a:font script="Arab" typeface="Times New Roman"/>
-        <a:font script="Hebr" typeface="Times New Roman"/>
-        <a:font script="Thai" typeface="Angsana New"/>
-        <a:font script="Ethi" typeface="Nyala"/>
-        <a:font script="Beng" typeface="Vrinda"/>
-        <a:font script="Gujr" typeface="Shruti"/>
-        <a:font script="Khmr" typeface="MoolBoran"/>
-        <a:font script="Knda" typeface="Tunga"/>
-        <a:font script="Guru" typeface="Raavi"/>
-        <a:font script="Cans" typeface="Euphemia"/>
-        <a:font script="Cher" typeface="Plantagenet Cherokee"/>
-        <a:font script="Yiii" typeface="Microsoft Yi Baiti"/>
-        <a:font script="Tibt" typeface="Microsoft Himalaya"/>
-        <a:font script="Thaa" typeface="MV Boli"/>
-        <a:font script="Deva" typeface="Mangal"/>
-        <a:font script="Telu" typeface="Gautami"/>
-        <a:font script="Taml" typeface="Latha"/>
-        <a:font script="Syrc" typeface="Estrangelo Edessa"/>
-        <a:font script="Orya" typeface="Kalinga"/>
-        <a:font script="Mlym" typeface="Kartika"/>
-        <a:font script="Laoo" typeface="DokChampa"/>
-        <a:font script="Sinh" typeface="Iskoola Pota"/>
-        <a:font script="Mong" typeface="Mongolian Baiti"/>
-        <a:font script="Viet" typeface="Times New Roman"/>
-        <a:font script="Uigh" typeface="Microsoft Uighur"/>
-        <a:font script="Geor" typeface="Sylfaen"/>
-        <a:font script="Armn" typeface="Arial"/>
-        <a:font script="Bugi" typeface="Leelawadee UI"/>
-        <a:font script="Bopo" typeface="Microsoft JhengHei"/>
-        <a:font script="Java" typeface="Javanese Text"/>
-        <a:font script="Lisu" typeface="Segoe UI"/>
-        <a:font script="Mymr" typeface="Myanmar Text"/>
-        <a:font script="Nkoo" typeface="Ebrima"/>
-        <a:font script="Olck" typeface="Nirmala UI"/>
-        <a:font script="Osma" typeface="Ebrima"/>
-        <a:font script="Phag" typeface="Phagspa"/>
-        <a:font script="Syrn" typeface="Estrangelo Edessa"/>
-        <a:font script="Syrj" typeface="Estrangelo Edessa"/>
-        <a:font script="Syre" typeface="Estrangelo Edessa"/>
-        <a:font script="Sora" typeface="Nirmala UI"/>
-        <a:font script="Tale" typeface="Microsoft Tai Le"/>
-        <a:font script="Talu" typeface="Microsoft New Tai Lue"/>
-        <a:font script="Tfng" typeface="Ebrima"/>
-      </a:majorFont>
-      <a:minorFont>
-        <a:latin typeface="Calibri" panose="020F0502020204030204"/>
-        <a:ea typeface=""/>
-        <a:cs typeface=""/>
-        <a:font script="Jpan" typeface="游明朝"/>
-        <a:font script="Hang" typeface="맑은 고딕"/>
-        <a:font script="Hans" typeface="等线"/>
-        <a:font script="Hant" typeface="新細明體"/>
-        <a:font script="Arab" typeface="Arial"/>
-        <a:font script="Hebr" typeface="Arial"/>
-        <a:font script="Thai" typeface="Cordia New"/>
-        <a:font script="Ethi" typeface="Nyala"/>
-        <a:font script="Beng" typeface="Vrinda"/>
-        <a:font script="Gujr" typeface="Shruti"/>
-        <a:font script="Khmr" typeface="DaunPenh"/>
-        <a:font script="Knda" typeface="Tunga"/>
-        <a:font script="Guru" typeface="Raavi"/>
-        <a:font script="Cans" typeface="Euphemia"/>
-        <a:font script="Cher" typeface="Plantagenet Cherokee"/>
-        <a:font script="Yiii" typeface="Microsoft Yi Baiti"/>
-        <a:font script="Tibt" typeface="Microsoft Himalaya"/>
-        <a:font script="Thaa" typeface="MV Boli"/>
-        <a:font script="Deva" typeface="Mangal"/>
-        <a:font script="Telu" typeface="Gautami"/>
-        <a:font script="Taml" typeface="Latha"/>
-        <a:font script="Syrc" typeface="Estrangelo Edessa"/>
-        <a:font script="Orya" typeface="Kalinga"/>
-        <a:font script="Mlym" typeface="Kartika"/>
-        <a:font script="Laoo" typeface="DokChampa"/>
-        <a:font script="Sinh" typeface="Iskoola Pota"/>
-        <a:font script="Mong" typeface="Mongolian Baiti"/>
-        <a:font script="Viet" typeface="Arial"/>
-        <a:font script="Uigh" typeface="Microsoft Uighur"/>
-        <a:font script="Geor" typeface="Sylfaen"/>
-        <a:font script="Armn" typeface="Arial"/>
-        <a:font script="Bugi" typeface="Leelawadee UI"/>
-        <a:font script="Bopo" typeface="Microsoft JhengHei"/>
-        <a:font script="Java" typeface="Javanese Text"/>
-        <a:font script="Lisu" typeface="Segoe UI"/>
-        <a:font script="Mymr" typeface="Myanmar Text"/>
-        <a:font script="Nkoo" typeface="Ebrima"/>
-        <a:font script="Olck" typeface="Nirmala UI"/>
-        <a:font script="Osma" typeface="Ebrima"/>
-        <a:font script="Phag" typeface="Phagspa"/>
-        <a:font script="Syrn" typeface="Estrangelo Edessa"/>
-        <a:font script="Syrj" typeface="Estrangelo Edessa"/>
-        <a:font script="Syre" typeface="Estrangelo Edessa"/>
-        <a:font script="Sora" typeface="Nirmala UI"/>
-        <a:font script="Tale" typeface="Microsoft Tai Le"/>
-        <a:font script="Talu" typeface="Microsoft New Tai Lue"/>
-        <a:font script="Tfng" typeface="Ebrima"/>
-      </a:minorFont>
-    </a:fontScheme>
-    <a:fmtScheme name="Office">
-      <a:fillStyleLst>
-        <a:solidFill>
-          <a:schemeClr val="phClr"/>
-        </a:solidFill>
-        <a:gradFill rotWithShape="true">
-          <a:gsLst>
-            <a:gs pos="0">
-              <a:schemeClr val="phClr">
-                <a:lumMod val="110000"/>
-                <a:satMod val="105000"/>
-                <a:tint val="67000"/>
-              </a:schemeClr>
-            </a:gs>
-            <a:gs pos="50000">
-              <a:schemeClr val="phClr">
-                <a:lumMod val="105000"/>
-                <a:satMod val="103000"/>
-                <a:tint val="73000"/>
-              </a:schemeClr>
-            </a:gs>
-            <a:gs pos="100000">
-              <a:schemeClr val="phClr">
-                <a:lumMod val="105000"/>
-                <a:satMod val="109000"/>
-                <a:tint val="81000"/>
-              </a:schemeClr>
-            </a:gs>
-          </a:gsLst>
-          <a:lin ang="5400000" scaled="false"/>
-        </a:gradFill>
-        <a:gradFill rotWithShape="true">
-          <a:gsLst>
-            <a:gs pos="0">
-              <a:schemeClr val="phClr">
-                <a:satMod val="103000"/>
-                <a:lumMod val="102000"/>
-                <a:tint val="94000"/>
-              </a:schemeClr>
-            </a:gs>
-            <a:gs pos="50000">
-              <a:schemeClr val="phClr">
-                <a:satMod val="110000"/>
-                <a:lumMod val="100000"/>
-                <a:shade val="100000"/>
-              </a:schemeClr>
-            </a:gs>
-            <a:gs pos="100000">
-              <a:schemeClr val="phClr">
-                <a:lumMod val="99000"/>
-                <a:satMod val="120000"/>
-                <a:shade val="78000"/>
-              </a:schemeClr>
-            </a:gs>
-          </a:gsLst>
-          <a:lin ang="5400000" scaled="false"/>
-        </a:gradFill>
-      </a:fillStyleLst>
-      <a:lnStyleLst>
-        <a:ln w="6350" cap="flat" cmpd="sng" algn="ctr">
-          <a:solidFill>
-            <a:schemeClr val="phClr"/>
-          </a:solidFill>
-          <a:prstDash val="solid"/>
-          <a:miter lim="800000"/>
-        </a:ln>
-        <a:ln w="12700" cap="flat" cmpd="sng" algn="ctr">
-          <a:solidFill>
-            <a:schemeClr val="phClr"/>
-          </a:solidFill>
-          <a:prstDash val="solid"/>
-          <a:miter lim="800000"/>
-        </a:ln>
-        <a:ln w="19050" cap="flat" cmpd="sng" algn="ctr">
-          <a:solidFill>
-            <a:schemeClr val="phClr"/>
-          </a:solidFill>
-          <a:prstDash val="solid"/>
-          <a:miter lim="800000"/>
-        </a:ln>
-      </a:lnStyleLst>
-      <a:effectStyleLst>
-        <a:effectStyle>
-          <a:effectLst/>
-        </a:effectStyle>
-        <a:effectStyle>
-          <a:effectLst/>
-        </a:effectStyle>
-        <a:effectStyle>
-          <a:effectLst>
-            <a:outerShdw blurRad="57150" dist="19050" dir="5400000" algn="ctr" rotWithShape="false">
-              <a:srgbClr val="000000">
-                <a:alpha val="63000"/>
-              </a:srgbClr>
-            </a:outerShdw>
-          </a:effectLst>
-        </a:effectStyle>
-      </a:effectStyleLst>
-      <a:bgFillStyleLst>
-        <a:solidFill>
-          <a:schemeClr val="phClr"/>
-        </a:solidFill>
-        <a:solidFill>
-          <a:schemeClr val="phClr">
-            <a:tint val="95000"/>
-            <a:satMod val="170000"/>
-          </a:schemeClr>
-        </a:solidFill>
-        <a:gradFill rotWithShape="true">
-          <a:gsLst>
-            <a:gs pos="0">
-              <a:schemeClr val="phClr">
-                <a:tint val="93000"/>
-                <a:satMod val="150000"/>
-                <a:shade val="98000"/>
-                <a:lumMod val="102000"/>
-              </a:schemeClr>
-            </a:gs>
-            <a:gs pos="50000">
-              <a:schemeClr val="phClr">
-                <a:tint val="98000"/>
-                <a:satMod val="130000"/>
-                <a:shade val="90000"/>
-                <a:lumMod val="103000"/>
-              </a:schemeClr>
-            </a:gs>
-            <a:gs pos="100000">
-              <a:schemeClr val="phClr">
-                <a:shade val="63000"/>
-                <a:satMod val="120000"/>
-              </a:schemeClr>
-            </a:gs>
-          </a:gsLst>
-          <a:lin ang="5400000" scaled="false"/>
-        </a:gradFill>
-      </a:bgFillStyleLst>
-    </a:fmtScheme>
-  </a:themeElements>
-  <a:objectDefaults/>
-  <a:extraClrSchemeLst/>
-</a:theme>
 </file>
</xml_diff>

<commit_message>
Controller_Main: no autopilot cuts the throttle when it lets go
The ascent and orbital burn autopilots cut the throttle to zero on every
hand-back. Now every disarm, abort, telemetry loss, re-plan and A/P OFF
leaves the throttle where it is, so the pilot takes over without a jump
in thrust. The cuts that are a mode's own job stay: ascent engine cutoff,
coast and end of circularization, a completed burn (DONE), BRAKE before
ignition, touchdown.

This also fixes A/P OFF still cutting the throttle after #82: arbAllOff()
calls apDisarm() first, which commanded zero through the throttle link
even with the ascent autopilot idle, taking the throttle over from the
landing or hold autopilot. apDisarm() now only releases its owners, and
the ascent telemetry-loss and COMPLETE paths release them too (they left
the ascent as throttle owner).

Refs #82

Co-Authored-By: Claude Opus 5.5 <noreply@anthropic.com>
Claude-Session: https://claude.ai/code/session_01AfFKiY5R8Xk7jem2zcWdES
</commit_message>
<xml_diff>
--- a/Documents/User/Info_Display_Screen_Reference.docx
+++ b/Documents/User/Info_Display_Screen_Reference.docx
@@ -25019,6 +25019,30 @@
           <w:b/>
           <w:bCs/>
         </w:rPr>
+        <w:t xml:space="preserve">The throttle stays where it is whenever an autopilot lets go</w:t>
+      </w:r>
+      <w:r>
+        <w:t xml:space="preserve">, whatever the cause: A/P OFF, tapping a mode off, DISARM, stick or lever input, the abort button, lost telemetry or another autopilot taking over. You take over at the thrust the autopilot was using, with no jump. The throttle goes to zero only when a mode's own job calls for it: ascent engine cutoff and coast, the end of a completed burn (</w:t>
+      </w:r>
+      <w:r>
+        <w:rPr>
+          <w:rFonts w:ascii="Consolas" w:cs="Consolas" w:eastAsia="Consolas" w:hAnsi="Consolas"/>
+        </w:rPr>
+        <w:t xml:space="preserve">DONE</w:t>
+      </w:r>
+      <w:r>
+        <w:t xml:space="preserve">), BRAKE waiting for its ignition altitude, and touchdown.</w:t>
+      </w:r>
+    </w:p>
+    <w:p>
+      <w:pPr>
+        <w:spacing w:after="120"/>
+      </w:pPr>
+      <w:r>
+        <w:rPr>
+          <w:b/>
+          <w:bCs/>
+        </w:rPr>
         <w:t xml:space="preserve">Pilot input disconnects every autopilot.</w:t>
       </w:r>
       <w:r>
@@ -25519,7 +25543,7 @@
         <w:spacing w:after="60"/>
       </w:pPr>
       <w:r>
-        <w:t xml:space="preserve">To stop, tap the button (DISARM), or take the stick or throttle.</w:t>
+        <w:t xml:space="preserve">To stop, tap the button (DISARM), or take the stick or throttle. The throttle stays where it is.</w:t>
       </w:r>
     </w:p>
     <w:p>
@@ -26424,7 +26448,7 @@
         <w:t xml:space="preserve">A/P OFF.</w:t>
       </w:r>
       <w:r>
-        <w:t xml:space="preserve"> Aborts and turns everything off.</w:t>
+        <w:t xml:space="preserve"> Aborts and turns everything off. A burn in progress keeps its throttle for you to take over; only a completed burn cuts it.</w:t>
       </w:r>
     </w:p>
     <w:p>

</xml_diff>

<commit_message>
InfoDisp 1.16.4: apoapsis and periapsis labels in mixed case
Every on-screen abbreviation now reads Ap / Pe, as the graphic markers and the
Annunciator's Pe LOW / Ap LOW tiles already did: ApA / PeA, T+Ap / T+Pe, Ap-Pe,
ARG.Pe, TGT Ap and the Orbital Autopilot's Ap / Pe burn buttons. Labels only.
Renders regenerated for the nine screens that carry them; user reference (and
its Word copy), Hold_Mode_Autopilot.md and Mission_Autopilot.md updated.

Co-Authored-By: Claude Opus 5.5 <noreply@anthropic.com>
Claude-Session: https://claude.ai/code/session_01AfFKiY5R8Xk7jem2zcWdES
</commit_message>
<xml_diff>
--- a/Documents/User/Info_Display_Screen_Reference.docx
+++ b/Documents/User/Info_Display_Screen_Reference.docx
@@ -52,7 +52,7 @@
         <w:t xml:space="preserve">Applies to:</w:t>
       </w:r>
       <w:r>
-        <w:t xml:space="preserve"> KCMk1_InfoDisp firmware 1.16.3</w:t>
+        <w:t xml:space="preserve"> KCMk1_InfoDisp firmware 1.16.4</w:t>
       </w:r>
     </w:p>
     <w:p>
@@ -4352,7 +4352,7 @@
           <w:b/>
           <w:bCs/>
         </w:rPr>
-        <w:t xml:space="preserve">T+AP</w:t>
+        <w:t xml:space="preserve">T+Ap</w:t>
       </w:r>
       <w:r>
         <w:t xml:space="preserve"> or </w:t>
@@ -4362,7 +4362,7 @@
           <w:b/>
           <w:bCs/>
         </w:rPr>
-        <w:t xml:space="preserve">T+PE</w:t>
+        <w:t xml:space="preserve">T+Pe</w:t>
       </w:r>
       <w:r>
         <w:t xml:space="preserve">, whichever apsis comes sooner.</w:t>
@@ -4435,7 +4435,7 @@
         <w:t xml:space="preserve">Dashes.</w:t>
       </w:r>
       <w:r>
-        <w:t xml:space="preserve"> ALT.SL, V.ORB / V.SRF, APA, PEA and T+AP dash out when KSP sends neither a positive apoapsis nor a positive periapsis. T+IGN dashes with no node.</w:t>
+        <w:t xml:space="preserve"> ALT.SL, V.ORB / V.SRF, ApA, PeA and T+Ap dash out when KSP sends neither a positive apoapsis nor a positive periapsis. T+IGN dashes with no node.</w:t>
       </w:r>
     </w:p>
     <w:p>
@@ -4455,7 +4455,7 @@
         <w:t xml:space="preserve">Escape trajectory.</w:t>
       </w:r>
       <w:r>
-        <w:t xml:space="preserve"> APA shows </w:t>
+        <w:t xml:space="preserve"> ApA shows </w:t>
       </w:r>
       <w:r>
         <w:rPr>
@@ -4791,7 +4791,7 @@
                 <w:sz w:val="17"/>
                 <w:szCs w:val="17"/>
               </w:rPr>
-              <w:t xml:space="preserve">APA</w:t>
+              <w:t xml:space="preserve">ApA</w:t>
             </w:r>
           </w:p>
         </w:tc>
@@ -4886,7 +4886,7 @@
                 <w:sz w:val="17"/>
                 <w:szCs w:val="17"/>
               </w:rPr>
-              <w:t xml:space="preserve">PEA</w:t>
+              <w:t xml:space="preserve">PeA</w:t>
             </w:r>
           </w:p>
         </w:tc>
@@ -4966,7 +4966,7 @@
                 <w:sz w:val="17"/>
                 <w:szCs w:val="17"/>
               </w:rPr>
-              <w:t xml:space="preserve">T+AP / T+PE</w:t>
+              <w:t xml:space="preserve">T+Ap / T+Pe</w:t>
             </w:r>
           </w:p>
         </w:tc>
@@ -11851,7 +11851,7 @@
         <w:t xml:space="preserve">Reading the screen.</w:t>
       </w:r>
       <w:r>
-        <w:t xml:space="preserve"> Keep the green FPA needle on the yellow target triangle. Watch the hollow Ap triangle climb toward the TGT ORB line. Back off the throttle if Q goes yellow (20 kPa) or red (40 kPa); it peaks around 5–8 km. STG.BRN and ΔV.STG warn of staging before the STAGE light does. T+AP turning yellow means apoapsis is less than 30 s away. Cut the throttle once apoapsis is above the atmosphere; the screen moves to CIRCULARIZATION by itself.</w:t>
+        <w:t xml:space="preserve"> Keep the green FPA needle on the yellow target triangle. Watch the hollow Ap triangle climb toward the TGT ORB line. Back off the throttle if Q goes yellow (20 kPa) or red (40 kPa); it peaks around 5–8 km. STG.BRN and ΔV.STG warn of staging before the STAGE light does. T+Ap turning yellow means apoapsis is less than 30 s away. Cut the throttle once apoapsis is above the atmosphere; the screen moves to CIRCULARIZATION by itself.</w:t>
       </w:r>
     </w:p>
     <w:p>
@@ -11866,7 +11866,7 @@
         <w:t xml:space="preserve">Special states.</w:t>
       </w:r>
       <w:r>
-        <w:t xml:space="preserve"> T+AP dashes with no apoapsis, on the pad or landed. Q and MACH dash outside the atmosphere. A closed throttle shows white on red here, because during the ascent it is an event; CIRCULARIZATION has no throttle alarm.</w:t>
+        <w:t xml:space="preserve"> T+Ap dashes with no apoapsis, on the pad or landed. Q and MACH dash outside the atmosphere. A closed throttle shows white on red here, because during the ascent it is an event; CIRCULARIZATION has no throttle alarm.</w:t>
       </w:r>
     </w:p>
     <w:p>
@@ -12013,7 +12013,7 @@
                 <w:sz w:val="17"/>
                 <w:szCs w:val="17"/>
               </w:rPr>
-              <w:t xml:space="preserve">T+AP</w:t>
+              <w:t xml:space="preserve">T+Ap</w:t>
             </w:r>
           </w:p>
         </w:tc>
@@ -12729,7 +12729,7 @@
           <w:b/>
           <w:bCs/>
         </w:rPr>
-        <w:t xml:space="preserve">ECC and AP-PE (left rail).</w:t>
+        <w:t xml:space="preserve">ECC and Ap-Pe (left rail).</w:t>
       </w:r>
       <w:r>
         <w:t xml:space="preserve"> The orbit's eccentricity and the height difference between apoapsis and periapsis.</w:t>
@@ -12978,7 +12978,7 @@
         <w:t xml:space="preserve">Special states.</w:t>
       </w:r>
       <w:r>
-        <w:t xml:space="preserve"> ECC and AP-PE dash with no apoapsis. ΔV.CIRC dashes when there is no usable estimate (no apoapsis, or already circular). On a suborbital coast the estimate uses the true ellipse, periapsis below the surface included, so it agrees with a KSP circularisation node (497 m/s in the picture).</w:t>
+        <w:t xml:space="preserve"> ECC and Ap-Pe dash with no apoapsis. ΔV.CIRC dashes when there is no usable estimate (no apoapsis, or already circular). On a suborbital coast the estimate uses the true ellipse, periapsis below the surface included, so it agrees with a KSP circularisation node (497 m/s in the picture).</w:t>
       </w:r>
     </w:p>
     <w:p>
@@ -13807,7 +13807,7 @@
                 <w:sz w:val="17"/>
                 <w:szCs w:val="17"/>
               </w:rPr>
-              <w:t xml:space="preserve">AP-PE</w:t>
+              <w:t xml:space="preserve">Ap-Pe</w:t>
             </w:r>
           </w:p>
         </w:tc>
@@ -14432,7 +14432,7 @@
         <w:t xml:space="preserve">Special states.</w:t>
       </w:r>
       <w:r>
-        <w:t xml:space="preserve"> PEA shows </w:t>
+        <w:t xml:space="preserve"> PeA shows </w:t>
       </w:r>
       <w:r>
         <w:rPr>
@@ -14441,7 +14441,7 @@
         <w:t xml:space="preserve">---</w:t>
       </w:r>
       <w:r>
-        <w:t xml:space="preserve"> with periapsis at or below sea level on a closed orbit; APA and PERIOD show </w:t>
+        <w:t xml:space="preserve"> with periapsis at or below sea level on a closed orbit; ApA and PERIOD show </w:t>
       </w:r>
       <w:r>
         <w:rPr>
@@ -14450,7 +14450,7 @@
         <w:t xml:space="preserve">∞</w:t>
       </w:r>
       <w:r>
-        <w:t xml:space="preserve"> on escape. The PEA and APA labels are drawn in the marker colours (magenta, blue) so each label names its dot.</w:t>
+        <w:t xml:space="preserve"> on escape. The PeA and ApA labels are drawn in the marker colours (magenta, blue) so each label names its dot.</w:t>
       </w:r>
     </w:p>
     <w:p>
@@ -14757,7 +14757,7 @@
                 <w:sz w:val="17"/>
                 <w:szCs w:val="17"/>
               </w:rPr>
-              <w:t xml:space="preserve">PEA</w:t>
+              <w:t xml:space="preserve">PeA</w:t>
             </w:r>
           </w:p>
         </w:tc>
@@ -14852,7 +14852,7 @@
                 <w:sz w:val="17"/>
                 <w:szCs w:val="17"/>
               </w:rPr>
-              <w:t xml:space="preserve">APA</w:t>
+              <w:t xml:space="preserve">ApA</w:t>
             </w:r>
           </w:p>
         </w:tc>
@@ -15249,7 +15249,7 @@
                 <w:sz w:val="17"/>
                 <w:szCs w:val="17"/>
               </w:rPr>
-              <w:t xml:space="preserve">ARG.PE</w:t>
+              <w:t xml:space="preserve">ARG.Pe</w:t>
             </w:r>
           </w:p>
         </w:tc>
@@ -15329,7 +15329,7 @@
                 <w:sz w:val="17"/>
                 <w:szCs w:val="17"/>
               </w:rPr>
-              <w:t xml:space="preserve">T+PE / T+AP</w:t>
+              <w:t xml:space="preserve">T+Pe / T+Ap</w:t>
             </w:r>
           </w:p>
         </w:tc>
@@ -15501,7 +15501,7 @@
         <w:t xml:space="preserve">Purpose.</w:t>
       </w:r>
       <w:r>
-        <w:t xml:space="preserve"> All fourteen orbital elements as text, for detailed planning: shape and size on the left, orientation and position on the right. SMA, ECC, PEA, APA and PERIOD use the same names and formats as ORBIT, so the two screens compare directly.</w:t>
+        <w:t xml:space="preserve"> All fourteen orbital elements as text, for detailed planning: shape and size on the left, orientation and position on the right. SMA, ECC, PeA, ApA and PERIOD use the same names and formats as ORBIT, so the two screens compare directly.</w:t>
       </w:r>
     </w:p>
     <w:p>
@@ -15531,7 +15531,7 @@
         <w:t xml:space="preserve">Reading the screen.</w:t>
       </w:r>
       <w:r>
-        <w:t xml:space="preserve"> True and mean anomaly give the vessel's position on the orbit; LAN with ARG.PE fixes the orbit's orientation in space.</w:t>
+        <w:t xml:space="preserve"> True and mean anomaly give the vessel's position on the orbit; LAN with ARG.Pe fixes the orbit's orientation in space.</w:t>
       </w:r>
     </w:p>
     <w:p>
@@ -15838,7 +15838,7 @@
                 <w:sz w:val="17"/>
                 <w:szCs w:val="17"/>
               </w:rPr>
-              <w:t xml:space="preserve">PEA</w:t>
+              <w:t xml:space="preserve">PeA</w:t>
             </w:r>
           </w:p>
         </w:tc>
@@ -15933,7 +15933,7 @@
                 <w:sz w:val="17"/>
                 <w:szCs w:val="17"/>
               </w:rPr>
-              <w:t xml:space="preserve">APA</w:t>
+              <w:t xml:space="preserve">ApA</w:t>
             </w:r>
           </w:p>
         </w:tc>
@@ -16570,7 +16570,7 @@
                 <w:sz w:val="17"/>
                 <w:szCs w:val="17"/>
               </w:rPr>
-              <w:t xml:space="preserve">ARG.PE</w:t>
+              <w:t xml:space="preserve">ARG.Pe</w:t>
             </w:r>
           </w:p>
         </w:tc>
@@ -16810,7 +16810,7 @@
                 <w:sz w:val="17"/>
                 <w:szCs w:val="17"/>
               </w:rPr>
-              <w:t xml:space="preserve">T+PE</w:t>
+              <w:t xml:space="preserve">T+Pe</w:t>
             </w:r>
           </w:p>
         </w:tc>
@@ -16905,7 +16905,7 @@
                 <w:sz w:val="17"/>
                 <w:szCs w:val="17"/>
               </w:rPr>
-              <w:t xml:space="preserve">T+AP</w:t>
+              <w:t xml:space="preserve">T+Ap</w:t>
             </w:r>
           </w:p>
         </w:tc>
@@ -23087,7 +23087,7 @@
         <w:spacing w:after="60"/>
       </w:pPr>
       <w:r>
-        <w:t xml:space="preserve">Before entry, put the magenta Pe marker in the green band; PEA reads green. Red is too steep; cyan means you will only aerobrake.</w:t>
+        <w:t xml:space="preserve">Before entry, put the magenta Pe marker in the green band; PeA reads green. Red is too steep; cyan means you will only aerobrake.</w:t>
       </w:r>
     </w:p>
     <w:p>
@@ -23811,7 +23811,7 @@
                 <w:sz w:val="17"/>
                 <w:szCs w:val="17"/>
               </w:rPr>
-              <w:t xml:space="preserve">PEA</w:t>
+              <w:t xml:space="preserve">PeA</w:t>
             </w:r>
           </w:p>
         </w:tc>
@@ -25373,7 +25373,7 @@
         <w:t xml:space="preserve">MISSION.</w:t>
       </w:r>
       <w:r>
-        <w:t xml:space="preserve"> TGT AP (target apoapsis, m); INC (target inclination, 0–180°); LAUNCH (NORTH or SOUTH, toggled by a tap).</w:t>
+        <w:t xml:space="preserve"> TGT Ap (target apoapsis, m); INC (target inclination, 0–180°); LAUNCH (NORTH or SOUTH, toggled by a tap).</w:t>
       </w:r>
     </w:p>
     <w:p>
@@ -25485,7 +25485,7 @@
         <w:spacing w:after="60"/>
       </w:pPr>
       <w:r>
-        <w:t xml:space="preserve">Set TGT AP, INC and LAUNCH, then the profile. Each value is sky blue until confirmed.</w:t>
+        <w:t xml:space="preserve">Set TGT Ap, INC and LAUNCH, then the profile. Each value is sky blue until confirmed.</w:t>
       </w:r>
     </w:p>
     <w:p>
@@ -26105,7 +26105,7 @@
                 <w:sz w:val="17"/>
                 <w:szCs w:val="17"/>
               </w:rPr>
-              <w:t xml:space="preserve">APA</w:t>
+              <w:t xml:space="preserve">ApA</w:t>
             </w:r>
           </w:p>
         </w:tc>
@@ -26185,7 +26185,7 @@
                 <w:sz w:val="17"/>
                 <w:szCs w:val="17"/>
               </w:rPr>
-              <w:t xml:space="preserve">PEA</w:t>
+              <w:t xml:space="preserve">PeA</w:t>
             </w:r>
           </w:p>
         </w:tc>
@@ -26378,7 +26378,7 @@
         <w:t xml:space="preserve">NO NODE</w:t>
       </w:r>
       <w:r>
-        <w:t xml:space="preserve">), AP and PE (target altitudes, m), INC (target inclination). Only one burn can be armed.</w:t>
+        <w:t xml:space="preserve">), Ap and Pe (target altitudes, m), INC (target inclination). Only one burn can be armed.</w:t>
       </w:r>
     </w:p>
     <w:p>
@@ -26473,7 +26473,7 @@
         <w:spacing w:after="60"/>
       </w:pPr>
       <w:r>
-        <w:t xml:space="preserve">For a node burn, create the node in KSP; for AP, PE or INC, enter the target.</w:t>
+        <w:t xml:space="preserve">For a node burn, create the node in KSP; for Ap, Pe or INC, enter the target.</w:t>
       </w:r>
     </w:p>
     <w:p>
@@ -26659,7 +26659,7 @@
         <w:t xml:space="preserve">REPLANNED</w:t>
       </w:r>
       <w:r>
-        <w:t xml:space="preserve"> (the orbit changed after EXEC; tap EXEC again). The AP, PE and INC boxes cannot be edited while BURNING.</w:t>
+        <w:t xml:space="preserve"> (the orbit changed after EXEC; tap EXEC again). The Ap, Pe and INC boxes cannot be edited while BURNING.</w:t>
       </w:r>
     </w:p>
     <w:p>

</xml_diff>